<commit_message>
Redesign presentation deck and fill team cover
- New editorial 8-slide pptx covering brief points A-G with charts and proper hierarchy
- Slide 1 cover lists all four team members with student numbers
- Report.docx cover synced and PDF regenerated to match
- group_xxx.zip repackaged with the updated deliverables
</commit_message>
<xml_diff>
--- a/deliverables/group_xxx_report.docx
+++ b/deliverables/group_xxx_report.docx
@@ -30,7 +30,7 @@
         <w:jc w:val="center"/>
       </w:pPr>
       <w:r>
-        <w:t>Group: group_xxx, replace before Moodle submission</w:t>
+        <w:t>Group: group_xxx, replace with the final group number before Moodle submission</w:t>
       </w:r>
     </w:p>
     <w:p>
@@ -38,7 +38,7 @@
         <w:jc w:val="center"/>
       </w:pPr>
       <w:r>
-        <w:t>Team members: NAME, STUDENT NUMBER, replace before Moodle submission</w:t>
+        <w:t>Team members: Daniyal Ahmad (20241831), Artemii Alekseev (20240645), Viktoriia German (20240650), João Panizzutti (20241624)</w:t>
       </w:r>
     </w:p>
     <w:p>

</xml_diff>